<commit_message>
Editorial revision: sample size in referable cases, EyePACS threshold-sign finding, case-mix analysis, R5 against argmax, outcome table, second-stage wording, AIIM cover letter
</commit_message>
<xml_diff>
--- a/paper/highlights.docx
+++ b/paper/highlights.docx
@@ -31,6 +31,14 @@
         <w:pStyle w:val="ListBullet"/>
       </w:pPr>
       <w:r>
+        <w:t>A transferred threshold's error took its sign from the development labels</w:t>
+      </w:r>
+    </w:p>
+    <w:p>
+      <w:pPr>
+        <w:pStyle w:val="ListBullet"/>
+      </w:pPr>
+      <w:r>
         <w:t>Refitting cut-points without retraining helped only where ranking survived</w:t>
       </w:r>
     </w:p>
@@ -39,15 +47,7 @@
         <w:pStyle w:val="ListBullet"/>
       </w:pPr>
       <w:r>
-        <w:t>Training seeds alone produced spurious per-grade differences between models</w:t>
-      </w:r>
-    </w:p>
-    <w:p>
-      <w:pPr>
-        <w:pStyle w:val="ListBullet"/>
-      </w:pPr>
-      <w:r>
-        <w:t>About 200 local labels set a referral threshold with under 20% risk of harm</w:t>
+        <w:t>Threshold risk depends on referable cases labelled: ~120 give about 10% risk</w:t>
       </w:r>
     </w:p>
     <w:sectPr>

</xml_diff>